<commit_message>
rules-checker: Bugfixes to abbreviations.py, geography.py and symbols.py - see body for details. All unit and evaluation tests passed
check_abbreviation_formats in abbreviations.py updated to check for in litt instead of in lit. GeographyChecker in geography checker updated to expand the list of recognised regions provided by Kew. check_ampersand_usage in symbols.py updated to not run the check on assessment information section
</commit_message>
<xml_diff>
--- a/iucn_rules_checker/evaluation/test_doc_rules_based.docx
+++ b/iucn_rules_checker/evaluation/test_doc_rules_based.docx
@@ -433,8 +433,23 @@
           <w:rFonts w:ascii="Georgia" w:hAnsi="Georgia"/>
           <w:highlight w:val="yellow"/>
         </w:rPr>
-        <w:t>in lit</w:t>
-      </w:r>
+        <w:t xml:space="preserve">in </w:t>
+      </w:r>
+      <w:proofErr w:type="spellStart"/>
+      <w:r>
+        <w:rPr>
+          <w:rFonts w:ascii="Georgia" w:hAnsi="Georgia"/>
+          <w:highlight w:val="yellow"/>
+        </w:rPr>
+        <w:t>lit</w:t>
+      </w:r>
+      <w:r>
+        <w:rPr>
+          <w:rFonts w:ascii="Georgia" w:hAnsi="Georgia"/>
+        </w:rPr>
+        <w:t>t</w:t>
+      </w:r>
+      <w:proofErr w:type="spellEnd"/>
       <w:r>
         <w:rPr>
           <w:rFonts w:ascii="Georgia" w:hAnsi="Georgia"/>
@@ -521,7 +536,33 @@
         <w:rPr>
           <w:rFonts w:ascii="Georgia" w:hAnsi="Georgia"/>
         </w:rPr>
-        <w:t>Not caught: Prof. Brown wrote etc. in lit. notes, while Rev Green and Assoc Prof</w:t>
+        <w:t xml:space="preserve">Not caught: Prof. Brown wrote etc. in </w:t>
+      </w:r>
+      <w:proofErr w:type="spellStart"/>
+      <w:r>
+        <w:rPr>
+          <w:rFonts w:ascii="Georgia" w:hAnsi="Georgia"/>
+        </w:rPr>
+        <w:t>li</w:t>
+      </w:r>
+      <w:r>
+        <w:rPr>
+          <w:rFonts w:ascii="Georgia" w:hAnsi="Georgia"/>
+        </w:rPr>
+        <w:t>t</w:t>
+      </w:r>
+      <w:r>
+        <w:rPr>
+          <w:rFonts w:ascii="Georgia" w:hAnsi="Georgia"/>
+        </w:rPr>
+        <w:t>t</w:t>
+      </w:r>
+      <w:proofErr w:type="spellEnd"/>
+      <w:r>
+        <w:rPr>
+          <w:rFonts w:ascii="Georgia" w:hAnsi="Georgia"/>
+        </w:rPr>
+        <w:t>. notes, while Rev Green and Assoc Prof</w:t>
       </w:r>
       <w:r>
         <w:rPr>
@@ -2316,7 +2357,19 @@
         <w:rPr>
           <w:rFonts w:ascii="Georgia" w:hAnsi="Georgia"/>
         </w:rPr>
-        <w:t>Not caught: The review also mentions North Korea, South Africa, North America, East Asia, and West &amp; Central Asia, while already-lowercase forms such as eastern Ecuador should be left alone.</w:t>
+        <w:t xml:space="preserve">Not caught: The review also mentions North Korea, South Africa, North America, East Asia, </w:t>
+      </w:r>
+      <w:r>
+        <w:rPr>
+          <w:rFonts w:ascii="Georgia" w:hAnsi="Georgia"/>
+        </w:rPr>
+        <w:t xml:space="preserve">North Andaman </w:t>
+      </w:r>
+      <w:r>
+        <w:rPr>
+          <w:rFonts w:ascii="Georgia" w:hAnsi="Georgia"/>
+        </w:rPr>
+        <w:t>and West &amp; Central Asia, while already-lowercase forms such as eastern Ecuador should be left alone.</w:t>
       </w:r>
     </w:p>
     <w:p>
@@ -3818,13 +3871,7 @@
         <w:rPr>
           <w:rFonts w:ascii="Georgia" w:hAnsi="Georgia"/>
         </w:rPr>
-        <w:t xml:space="preserve"> occurs in cloud forest</w:t>
-      </w:r>
-      <w:r>
-        <w:rPr>
-          <w:rFonts w:ascii="Georgia" w:hAnsi="Georgia"/>
-        </w:rPr>
-        <w:t>.</w:t>
+        <w:t xml:space="preserve"> occurs in cloud forest.</w:t>
       </w:r>
     </w:p>
     <w:p>
@@ -6022,6 +6069,7 @@
   <w:style w:type="character" w:default="1" w:styleId="DefaultParagraphFont">
     <w:name w:val="Default Paragraph Font"/>
     <w:uiPriority w:val="1"/>
+    <w:semiHidden/>
     <w:unhideWhenUsed/>
   </w:style>
   <w:style w:type="table" w:default="1" w:styleId="TableNormal">

</xml_diff>

<commit_message>
rules-checker: evaluation updated based on atest changed to rules based system (inclusion of TableChecker). Readmes updated. No functional changes to code
</commit_message>
<xml_diff>
--- a/iucn_rules_checker/evaluation/test_doc_rules_based.docx
+++ b/iucn_rules_checker/evaluation/test_doc_rules_based.docx
@@ -5560,6 +5560,300 @@
         </w:rPr>
         <w:t xml:space="preserve"> rule, and the imported range-dash rule.</w:t>
       </w:r>
+    </w:p>
+    <w:p>
+      <w:pPr>
+        <w:pStyle w:val="Heading2"/>
+        <w:divId w:val="107286022"/>
+        <w:rPr>
+          <w:rFonts w:ascii="Georgia" w:eastAsia="Times New Roman" w:hAnsi="Georgia"/>
+          <w:sz w:val="27"/>
+          <w:szCs w:val="27"/>
+        </w:rPr>
+      </w:pPr>
+      <w:r>
+        <w:rPr>
+          <w:rFonts w:ascii="Georgia" w:eastAsia="Times New Roman" w:hAnsi="Georgia"/>
+          <w:sz w:val="27"/>
+          <w:szCs w:val="27"/>
+        </w:rPr>
+        <w:t>tables</w:t>
+      </w:r>
+      <w:r>
+        <w:rPr>
+          <w:rFonts w:ascii="Georgia" w:eastAsia="Times New Roman" w:hAnsi="Georgia"/>
+          <w:sz w:val="27"/>
+          <w:szCs w:val="27"/>
+        </w:rPr>
+        <w:t>.py</w:t>
+      </w:r>
+    </w:p>
+    <w:p>
+      <w:pPr>
+        <w:pStyle w:val="NormalWeb"/>
+        <w:spacing w:before="0" w:beforeAutospacing="0" w:after="0" w:afterAutospacing="0"/>
+        <w:jc w:val="both"/>
+        <w:divId w:val="107286022"/>
+        <w:rPr>
+          <w:rFonts w:ascii="Georgia" w:hAnsi="Georgia"/>
+        </w:rPr>
+      </w:pPr>
+    </w:p>
+    <w:tbl>
+      <w:tblPr>
+        <w:tblW w:w="0" w:type="auto"/>
+        <w:tblCellSpacing w:w="15" w:type="dxa"/>
+        <w:tblBorders>
+          <w:top w:val="single" w:sz="6" w:space="0" w:color="808080"/>
+          <w:left w:val="single" w:sz="6" w:space="0" w:color="808080"/>
+          <w:bottom w:val="single" w:sz="6" w:space="0" w:color="808080"/>
+          <w:right w:val="single" w:sz="6" w:space="0" w:color="808080"/>
+        </w:tblBorders>
+        <w:tblCellMar>
+          <w:top w:w="15" w:type="dxa"/>
+          <w:left w:w="15" w:type="dxa"/>
+          <w:bottom w:w="15" w:type="dxa"/>
+          <w:right w:w="15" w:type="dxa"/>
+        </w:tblCellMar>
+        <w:tblLook w:val="04A0" w:firstRow="1" w:lastRow="0" w:firstColumn="1" w:lastColumn="0" w:noHBand="0" w:noVBand="1"/>
+      </w:tblPr>
+      <w:tblGrid>
+        <w:gridCol w:w="2162"/>
+        <w:gridCol w:w="2380"/>
+        <w:gridCol w:w="4468"/>
+      </w:tblGrid>
+      <w:tr>
+        <w:trPr>
+          <w:divId w:val="107286022"/>
+          <w:tblCellSpacing w:w="15" w:type="dxa"/>
+        </w:trPr>
+        <w:tc>
+          <w:tcPr>
+            <w:tcW w:w="0" w:type="auto"/>
+            <w:tcBorders>
+              <w:bottom w:val="single" w:sz="6" w:space="0" w:color="000000"/>
+            </w:tcBorders>
+            <w:shd w:val="clear" w:color="auto" w:fill="BBBBBB"/>
+            <w:vAlign w:val="center"/>
+            <w:hideMark/>
+          </w:tcPr>
+          <w:p>
+            <w:pPr>
+              <w:spacing w:after="75"/>
+              <w:rPr>
+                <w:rFonts w:ascii="Georgia" w:eastAsia="Times New Roman" w:hAnsi="Georgia"/>
+                <w:b/>
+                <w:bCs/>
+                <w:sz w:val="18"/>
+                <w:szCs w:val="18"/>
+              </w:rPr>
+            </w:pPr>
+            <w:r>
+              <w:rPr>
+                <w:rFonts w:ascii="Georgia" w:eastAsia="Times New Roman" w:hAnsi="Georgia"/>
+                <w:b/>
+                <w:bCs/>
+                <w:sz w:val="18"/>
+                <w:szCs w:val="18"/>
+              </w:rPr>
+              <w:t>Estimated extent of occurrence (EOO)- in km2</w:t>
+            </w:r>
+          </w:p>
+        </w:tc>
+        <w:tc>
+          <w:tcPr>
+            <w:tcW w:w="0" w:type="auto"/>
+            <w:tcBorders>
+              <w:bottom w:val="single" w:sz="6" w:space="0" w:color="000000"/>
+            </w:tcBorders>
+            <w:shd w:val="clear" w:color="auto" w:fill="BBBBBB"/>
+            <w:vAlign w:val="center"/>
+            <w:hideMark/>
+          </w:tcPr>
+          <w:p>
+            <w:pPr>
+              <w:spacing w:after="75"/>
+              <w:rPr>
+                <w:rFonts w:ascii="Georgia" w:eastAsia="Times New Roman" w:hAnsi="Georgia"/>
+                <w:b/>
+                <w:bCs/>
+                <w:sz w:val="18"/>
+                <w:szCs w:val="18"/>
+              </w:rPr>
+            </w:pPr>
+            <w:r>
+              <w:rPr>
+                <w:rFonts w:ascii="Georgia" w:eastAsia="Times New Roman" w:hAnsi="Georgia"/>
+                <w:b/>
+                <w:bCs/>
+                <w:sz w:val="18"/>
+                <w:szCs w:val="18"/>
+              </w:rPr>
+              <w:t>EOO estimate calculated from Minimum Convex Polygon</w:t>
+            </w:r>
+          </w:p>
+        </w:tc>
+        <w:tc>
+          <w:tcPr>
+            <w:tcW w:w="0" w:type="auto"/>
+            <w:tcBorders>
+              <w:bottom w:val="single" w:sz="6" w:space="0" w:color="000000"/>
+            </w:tcBorders>
+            <w:shd w:val="clear" w:color="auto" w:fill="BBBBBB"/>
+            <w:vAlign w:val="center"/>
+            <w:hideMark/>
+          </w:tcPr>
+          <w:p>
+            <w:pPr>
+              <w:spacing w:after="75"/>
+              <w:rPr>
+                <w:rFonts w:ascii="Georgia" w:eastAsia="Times New Roman" w:hAnsi="Georgia"/>
+                <w:b/>
+                <w:bCs/>
+                <w:sz w:val="18"/>
+                <w:szCs w:val="18"/>
+              </w:rPr>
+            </w:pPr>
+            <w:r>
+              <w:rPr>
+                <w:rFonts w:ascii="Georgia" w:eastAsia="Times New Roman" w:hAnsi="Georgia"/>
+                <w:b/>
+                <w:bCs/>
+                <w:sz w:val="18"/>
+                <w:szCs w:val="18"/>
+              </w:rPr>
+              <w:t>Justification</w:t>
+            </w:r>
+          </w:p>
+        </w:tc>
+      </w:tr>
+      <w:tr>
+        <w:trPr>
+          <w:divId w:val="107286022"/>
+          <w:tblCellSpacing w:w="15" w:type="dxa"/>
+        </w:trPr>
+        <w:tc>
+          <w:tcPr>
+            <w:tcW w:w="0" w:type="auto"/>
+            <w:vAlign w:val="center"/>
+            <w:hideMark/>
+          </w:tcPr>
+          <w:p>
+            <w:pPr>
+              <w:spacing w:after="75"/>
+              <w:rPr>
+                <w:rFonts w:ascii="Georgia" w:eastAsia="Times New Roman" w:hAnsi="Georgia"/>
+                <w:sz w:val="18"/>
+                <w:szCs w:val="18"/>
+              </w:rPr>
+            </w:pPr>
+            <w:r>
+              <w:rPr>
+                <w:rFonts w:ascii="Georgia" w:eastAsia="Times New Roman" w:hAnsi="Georgia"/>
+                <w:sz w:val="18"/>
+                <w:szCs w:val="18"/>
+              </w:rPr>
+              <w:t>8402194</w:t>
+            </w:r>
+          </w:p>
+        </w:tc>
+        <w:tc>
+          <w:tcPr>
+            <w:tcW w:w="0" w:type="auto"/>
+            <w:vAlign w:val="center"/>
+            <w:hideMark/>
+          </w:tcPr>
+          <w:p>
+            <w:pPr>
+              <w:spacing w:after="75"/>
+              <w:rPr>
+                <w:rFonts w:ascii="Georgia" w:eastAsia="Times New Roman" w:hAnsi="Georgia"/>
+                <w:sz w:val="18"/>
+                <w:szCs w:val="18"/>
+              </w:rPr>
+            </w:pPr>
+            <w:r>
+              <w:rPr>
+                <w:rFonts w:ascii="Georgia" w:eastAsia="Times New Roman" w:hAnsi="Georgia"/>
+                <w:sz w:val="18"/>
+                <w:szCs w:val="18"/>
+              </w:rPr>
+              <w:t>true</w:t>
+            </w:r>
+          </w:p>
+        </w:tc>
+        <w:tc>
+          <w:tcPr>
+            <w:tcW w:w="0" w:type="auto"/>
+            <w:vAlign w:val="center"/>
+            <w:hideMark/>
+          </w:tcPr>
+          <w:p>
+            <w:pPr>
+              <w:spacing w:after="75"/>
+              <w:rPr>
+                <w:rFonts w:ascii="Georgia" w:eastAsia="Times New Roman" w:hAnsi="Georgia"/>
+                <w:sz w:val="18"/>
+                <w:szCs w:val="18"/>
+              </w:rPr>
+            </w:pPr>
+            <w:r>
+              <w:rPr>
+                <w:rFonts w:ascii="Georgia" w:eastAsia="Times New Roman" w:hAnsi="Georgia"/>
+                <w:sz w:val="18"/>
+                <w:szCs w:val="18"/>
+              </w:rPr>
+              <w:t xml:space="preserve">Estimated from a minimum convex polygon for georeferenced herbarium specimens point data mapped using </w:t>
+            </w:r>
+            <w:proofErr w:type="spellStart"/>
+            <w:r>
+              <w:rPr>
+                <w:rFonts w:ascii="Georgia" w:eastAsia="Times New Roman" w:hAnsi="Georgia"/>
+                <w:sz w:val="18"/>
+                <w:szCs w:val="18"/>
+              </w:rPr>
+              <w:t>GeoCAT</w:t>
+            </w:r>
+            <w:proofErr w:type="spellEnd"/>
+            <w:r>
+              <w:rPr>
+                <w:rFonts w:ascii="Georgia" w:eastAsia="Times New Roman" w:hAnsi="Georgia"/>
+                <w:sz w:val="18"/>
+                <w:szCs w:val="18"/>
+              </w:rPr>
+              <w:t xml:space="preserve"> (Bachman </w:t>
+            </w:r>
+            <w:r>
+              <w:rPr>
+                <w:rFonts w:ascii="Georgia" w:eastAsia="Times New Roman" w:hAnsi="Georgia"/>
+                <w:sz w:val="18"/>
+                <w:szCs w:val="18"/>
+                <w:highlight w:val="yellow"/>
+              </w:rPr>
+              <w:t>et al.</w:t>
+            </w:r>
+            <w:r>
+              <w:rPr>
+                <w:rFonts w:ascii="Georgia" w:eastAsia="Times New Roman" w:hAnsi="Georgia"/>
+                <w:sz w:val="18"/>
+                <w:szCs w:val="18"/>
+              </w:rPr>
+              <w:t xml:space="preserve"> 2011).</w:t>
+            </w:r>
+          </w:p>
+        </w:tc>
+      </w:tr>
+    </w:tbl>
+    <w:p>
+      <w:pPr>
+        <w:pStyle w:val="NormalWeb"/>
+        <w:spacing w:before="0" w:beforeAutospacing="0" w:after="0" w:afterAutospacing="0"/>
+        <w:jc w:val="both"/>
+        <w:divId w:val="107286022"/>
+        <w:rPr>
+          <w:rFonts w:ascii="Georgia" w:hAnsi="Georgia"/>
+        </w:rPr>
+      </w:pPr>
     </w:p>
     <w:sectPr>
       <w:pgSz w:w="11906" w:h="16838"/>

</xml_diff>